<commit_message>
Fix GGUF loader: dispatch by general.architecture (Qwen/Gemma/Phi/GLM4), not always Llama
Resolves 'from_gguf: cannot find llama.attention.head_count in metadata' when
loading non-Llama GGUFs. QuantizedLlama::load now reads general.architecture and
routes to the matching candle-transformers quantized parser, with a helpful error
for unsupported families. Also broadens EOS-token detection and documents
supported architectures in USAGE.md.
</commit_message>
<xml_diff>
--- a/USAGE.docx
+++ b/USAGE.docx
@@ -2,7 +2,7 @@
 <file path=word/document.xml><?xml version="1.0" encoding="utf-8"?>
 <w:document xmlns:w="http://schemas.openxmlformats.org/wordprocessingml/2006/main" xmlns:m="http://schemas.openxmlformats.org/officeDocument/2006/math" xmlns:r="http://schemas.openxmlformats.org/officeDocument/2006/relationships" xmlns:o="urn:schemas-microsoft-com:office:office" xmlns:v="urn:schemas-microsoft-com:vml" xmlns:w10="urn:schemas-microsoft-com:office:word" xmlns:a="http://schemas.openxmlformats.org/drawingml/2006/main" xmlns:pic="http://schemas.openxmlformats.org/drawingml/2006/picture" xmlns:wp="http://schemas.openxmlformats.org/drawingml/2006/wordprocessingDrawing">
   <w:body>
-    <w:bookmarkStart w:id="72" w:name="usage-guide"/>
+    <w:bookmarkStart w:id="73" w:name="usage-guide"/>
     <w:p>
       <w:pPr>
         <w:pStyle w:val="Heading1"/>
@@ -5894,7 +5894,7 @@
     </w:p>
     <w:bookmarkEnd w:id="46"/>
     <w:bookmarkEnd w:id="47"/>
-    <w:bookmarkStart w:id="54" w:name="model-selection"/>
+    <w:bookmarkStart w:id="55" w:name="model-selection"/>
     <w:p>
       <w:pPr>
         <w:pStyle w:val="Heading2"/>
@@ -6554,7 +6554,7 @@
       </w:r>
     </w:p>
     <w:bookmarkEnd w:id="49"/>
-    <w:bookmarkStart w:id="50" w:name="real-local-gguf-model"/>
+    <w:bookmarkStart w:id="51" w:name="real-local-gguf-model"/>
     <w:p>
       <w:pPr>
         <w:pStyle w:val="Heading3"/>
@@ -6843,14 +6843,13 @@
         <w:t xml:space="preserve">, etc.).</w:t>
       </w:r>
     </w:p>
-    <w:bookmarkEnd w:id="50"/>
-    <w:bookmarkStart w:id="52" w:name="where-to-get-models"/>
-    <w:p>
-      <w:pPr>
-        <w:pStyle w:val="Heading3"/>
-      </w:pPr>
-      <w:r>
-        <w:t xml:space="preserve">Where to Get Models</w:t>
+    <w:bookmarkStart w:id="50" w:name="X9fe6ab6c451b041aaa6dfec0780ff30d42d72df"/>
+    <w:p>
+      <w:pPr>
+        <w:pStyle w:val="Heading4"/>
+      </w:pPr>
+      <w:r>
+        <w:t xml:space="preserve">Supported model architectures (not just Llama)</w:t>
       </w:r>
     </w:p>
     <w:p>
@@ -6858,45 +6857,850 @@
         <w:pStyle w:val="FirstParagraph"/>
       </w:pPr>
       <w:r>
-        <w:t xml:space="preserve">GGUF is the quantized model format used by</w:t>
-      </w:r>
-      <w:r>
-        <w:t xml:space="preserve"> </w:t>
-      </w:r>
-      <w:r>
-        <w:rPr>
-          <w:rStyle w:val="VerbatimChar"/>
-        </w:rPr>
-        <w:t xml:space="preserve">llama.cpp</w:t>
-      </w:r>
-      <w:r>
-        <w:t xml:space="preserve"> </w:t>
-      </w:r>
-      <w:r>
-        <w:t xml:space="preserve">and supported here via</w:t>
-      </w:r>
-      <w:r>
-        <w:t xml:space="preserve"> </w:t>
-      </w:r>
-      <w:r>
-        <w:rPr>
-          <w:rStyle w:val="VerbatimChar"/>
-        </w:rPr>
-        <w:t xml:space="preserve">candle</w:t>
-      </w:r>
-      <w:r>
-        <w:t xml:space="preserve">. To swap in a real model:</w:t>
-      </w:r>
-    </w:p>
-    <w:p>
-      <w:pPr>
-        <w:pStyle w:val="BodyText"/>
-      </w:pPr>
+        <w:t xml:space="preserve">The loader inspects the GGUF’s</w:t>
+      </w:r>
+      <w:r>
+        <w:t xml:space="preserve"> </w:t>
+      </w:r>
+      <w:r>
+        <w:rPr>
+          <w:rStyle w:val="VerbatimChar"/>
+        </w:rPr>
+        <w:t xml:space="preserve">general.architecture</w:t>
+      </w:r>
+      <w:r>
+        <w:t xml:space="preserve"> </w:t>
+      </w:r>
+      <w:r>
+        <w:t xml:space="preserve">metadata field and dispatches to the matching</w:t>
+      </w:r>
+      <w:r>
+        <w:t xml:space="preserve"> </w:t>
+      </w:r>
+      <w:r>
+        <w:rPr>
+          <w:rStyle w:val="VerbatimChar"/>
+        </w:rPr>
+        <w:t xml:space="preserve">candle-transformers</w:t>
+      </w:r>
+      <w:r>
+        <w:t xml:space="preserve"> </w:t>
+      </w:r>
+      <w:r>
+        <w:t xml:space="preserve">parser automatically. You do</w:t>
+      </w:r>
+      <w:r>
+        <w:t xml:space="preserve"> </w:t>
+      </w:r>
       <w:r>
         <w:rPr>
           <w:bCs/>
           <w:b/>
         </w:rPr>
+        <w:t xml:space="preserve">not</w:t>
+      </w:r>
+      <w:r>
+        <w:t xml:space="preserve"> </w:t>
+      </w:r>
+      <w:r>
+        <w:t xml:space="preserve">need to tell it which family a model is — just point</w:t>
+      </w:r>
+      <w:r>
+        <w:t xml:space="preserve"> </w:t>
+      </w:r>
+      <w:r>
+        <w:rPr>
+          <w:rStyle w:val="VerbatimChar"/>
+        </w:rPr>
+        <w:t xml:space="preserve">--model</w:t>
+      </w:r>
+      <w:r>
+        <w:t xml:space="preserve"> </w:t>
+      </w:r>
+      <w:r>
+        <w:t xml:space="preserve">at the</w:t>
+      </w:r>
+      <w:r>
+        <w:t xml:space="preserve"> </w:t>
+      </w:r>
+      <w:r>
+        <w:rPr>
+          <w:rStyle w:val="VerbatimChar"/>
+        </w:rPr>
+        <w:t xml:space="preserve">.gguf</w:t>
+      </w:r>
+      <w:r>
+        <w:t xml:space="preserve">. Supported architectures:</w:t>
+      </w:r>
+    </w:p>
+    <w:tbl>
+      <w:tblPr>
+        <w:tblStyle w:val="Table"/>
+        <w:tblW w:type="pct" w:w="5000"/>
+        <w:tblLook w:firstRow="1" w:lastRow="0" w:firstColumn="0" w:lastColumn="0" w:noHBand="0" w:noVBand="0" w:val="0020"/>
+      </w:tblPr>
+      <w:tblGrid>
+        <w:gridCol w:w="2640"/>
+        <w:gridCol w:w="2640"/>
+        <w:gridCol w:w="2640"/>
+      </w:tblGrid>
+      <w:tr>
+        <w:trPr>
+          <w:tblHeader w:val="true"/>
+        </w:trPr>
+        <w:tc>
+          <w:tcPr/>
+          <w:p>
+            <w:pPr>
+              <w:pStyle w:val="Compact"/>
+              <w:jc w:val="left"/>
+            </w:pPr>
+            <w:r>
+              <w:rPr>
+                <w:rStyle w:val="VerbatimChar"/>
+              </w:rPr>
+              <w:t xml:space="preserve">general.architecture</w:t>
+            </w:r>
+          </w:p>
+        </w:tc>
+        <w:tc>
+          <w:tcPr/>
+          <w:p>
+            <w:pPr>
+              <w:pStyle w:val="Compact"/>
+              <w:jc w:val="left"/>
+            </w:pPr>
+            <w:r>
+              <w:t xml:space="preserve">Parser used</w:t>
+            </w:r>
+          </w:p>
+        </w:tc>
+        <w:tc>
+          <w:tcPr/>
+          <w:p>
+            <w:pPr>
+              <w:pStyle w:val="Compact"/>
+              <w:jc w:val="left"/>
+            </w:pPr>
+            <w:r>
+              <w:t xml:space="preserve">Example models</w:t>
+            </w:r>
+          </w:p>
+        </w:tc>
+      </w:tr>
+      <w:tr>
+        <w:tc>
+          <w:tcPr/>
+          <w:p>
+            <w:pPr>
+              <w:pStyle w:val="Compact"/>
+              <w:jc w:val="left"/>
+            </w:pPr>
+            <w:r>
+              <w:rPr>
+                <w:rStyle w:val="VerbatimChar"/>
+              </w:rPr>
+              <w:t xml:space="preserve">llama</w:t>
+            </w:r>
+            <w:r>
+              <w:t xml:space="preserve">,</w:t>
+            </w:r>
+            <w:r>
+              <w:t xml:space="preserve"> </w:t>
+            </w:r>
+            <w:r>
+              <w:rPr>
+                <w:rStyle w:val="VerbatimChar"/>
+              </w:rPr>
+              <w:t xml:space="preserve">mistral</w:t>
+            </w:r>
+            <w:r>
+              <w:t xml:space="preserve">,</w:t>
+            </w:r>
+            <w:r>
+              <w:t xml:space="preserve"> </w:t>
+            </w:r>
+            <w:r>
+              <w:rPr>
+                <w:rStyle w:val="VerbatimChar"/>
+              </w:rPr>
+              <w:t xml:space="preserve">mixtral</w:t>
+            </w:r>
+          </w:p>
+        </w:tc>
+        <w:tc>
+          <w:tcPr/>
+          <w:p>
+            <w:pPr>
+              <w:pStyle w:val="Compact"/>
+              <w:jc w:val="left"/>
+            </w:pPr>
+            <w:r>
+              <w:rPr>
+                <w:rStyle w:val="VerbatimChar"/>
+              </w:rPr>
+              <w:t xml:space="preserve">quantized_llama</w:t>
+            </w:r>
+          </w:p>
+        </w:tc>
+        <w:tc>
+          <w:tcPr/>
+          <w:p>
+            <w:pPr>
+              <w:pStyle w:val="Compact"/>
+              <w:jc w:val="left"/>
+            </w:pPr>
+            <w:r>
+              <w:t xml:space="preserve">Llama 2/3, Mistral, Mixtral, TinyLlama</w:t>
+            </w:r>
+          </w:p>
+        </w:tc>
+      </w:tr>
+      <w:tr>
+        <w:tc>
+          <w:tcPr/>
+          <w:p>
+            <w:pPr>
+              <w:pStyle w:val="Compact"/>
+              <w:jc w:val="left"/>
+            </w:pPr>
+            <w:r>
+              <w:rPr>
+                <w:rStyle w:val="VerbatimChar"/>
+              </w:rPr>
+              <w:t xml:space="preserve">qwen2</w:t>
+            </w:r>
+          </w:p>
+        </w:tc>
+        <w:tc>
+          <w:tcPr/>
+          <w:p>
+            <w:pPr>
+              <w:pStyle w:val="Compact"/>
+              <w:jc w:val="left"/>
+            </w:pPr>
+            <w:r>
+              <w:rPr>
+                <w:rStyle w:val="VerbatimChar"/>
+              </w:rPr>
+              <w:t xml:space="preserve">quantized_qwen2</w:t>
+            </w:r>
+          </w:p>
+        </w:tc>
+        <w:tc>
+          <w:tcPr/>
+          <w:p>
+            <w:pPr>
+              <w:pStyle w:val="Compact"/>
+              <w:jc w:val="left"/>
+            </w:pPr>
+            <w:r>
+              <w:t xml:space="preserve">Qwen2 / Qwen2.5</w:t>
+            </w:r>
+          </w:p>
+        </w:tc>
+      </w:tr>
+      <w:tr>
+        <w:tc>
+          <w:tcPr/>
+          <w:p>
+            <w:pPr>
+              <w:pStyle w:val="Compact"/>
+              <w:jc w:val="left"/>
+            </w:pPr>
+            <w:r>
+              <w:rPr>
+                <w:rStyle w:val="VerbatimChar"/>
+              </w:rPr>
+              <w:t xml:space="preserve">qwen3</w:t>
+            </w:r>
+          </w:p>
+        </w:tc>
+        <w:tc>
+          <w:tcPr/>
+          <w:p>
+            <w:pPr>
+              <w:pStyle w:val="Compact"/>
+              <w:jc w:val="left"/>
+            </w:pPr>
+            <w:r>
+              <w:rPr>
+                <w:rStyle w:val="VerbatimChar"/>
+              </w:rPr>
+              <w:t xml:space="preserve">quantized_qwen3</w:t>
+            </w:r>
+          </w:p>
+        </w:tc>
+        <w:tc>
+          <w:tcPr/>
+          <w:p>
+            <w:pPr>
+              <w:pStyle w:val="Compact"/>
+              <w:jc w:val="left"/>
+            </w:pPr>
+            <w:r>
+              <w:t xml:space="preserve">Qwen3</w:t>
+            </w:r>
+          </w:p>
+        </w:tc>
+      </w:tr>
+      <w:tr>
+        <w:tc>
+          <w:tcPr/>
+          <w:p>
+            <w:pPr>
+              <w:pStyle w:val="Compact"/>
+              <w:jc w:val="left"/>
+            </w:pPr>
+            <w:r>
+              <w:rPr>
+                <w:rStyle w:val="VerbatimChar"/>
+              </w:rPr>
+              <w:t xml:space="preserve">gemma</w:t>
+            </w:r>
+            <w:r>
+              <w:t xml:space="preserve">,</w:t>
+            </w:r>
+            <w:r>
+              <w:t xml:space="preserve"> </w:t>
+            </w:r>
+            <w:r>
+              <w:rPr>
+                <w:rStyle w:val="VerbatimChar"/>
+              </w:rPr>
+              <w:t xml:space="preserve">gemma2</w:t>
+            </w:r>
+            <w:r>
+              <w:t xml:space="preserve">,</w:t>
+            </w:r>
+            <w:r>
+              <w:t xml:space="preserve"> </w:t>
+            </w:r>
+            <w:r>
+              <w:rPr>
+                <w:rStyle w:val="VerbatimChar"/>
+              </w:rPr>
+              <w:t xml:space="preserve">gemma3</w:t>
+            </w:r>
+          </w:p>
+        </w:tc>
+        <w:tc>
+          <w:tcPr/>
+          <w:p>
+            <w:pPr>
+              <w:pStyle w:val="Compact"/>
+              <w:jc w:val="left"/>
+            </w:pPr>
+            <w:r>
+              <w:rPr>
+                <w:rStyle w:val="VerbatimChar"/>
+              </w:rPr>
+              <w:t xml:space="preserve">quantized_gemma3</w:t>
+            </w:r>
+          </w:p>
+        </w:tc>
+        <w:tc>
+          <w:tcPr/>
+          <w:p>
+            <w:pPr>
+              <w:pStyle w:val="Compact"/>
+              <w:jc w:val="left"/>
+            </w:pPr>
+            <w:r>
+              <w:t xml:space="preserve">Gemma / Gemma 2 / Gemma 3</w:t>
+            </w:r>
+          </w:p>
+        </w:tc>
+      </w:tr>
+      <w:tr>
+        <w:tc>
+          <w:tcPr/>
+          <w:p>
+            <w:pPr>
+              <w:pStyle w:val="Compact"/>
+              <w:jc w:val="left"/>
+            </w:pPr>
+            <w:r>
+              <w:rPr>
+                <w:rStyle w:val="VerbatimChar"/>
+              </w:rPr>
+              <w:t xml:space="preserve">phi3</w:t>
+            </w:r>
+          </w:p>
+        </w:tc>
+        <w:tc>
+          <w:tcPr/>
+          <w:p>
+            <w:pPr>
+              <w:pStyle w:val="Compact"/>
+              <w:jc w:val="left"/>
+            </w:pPr>
+            <w:r>
+              <w:rPr>
+                <w:rStyle w:val="VerbatimChar"/>
+              </w:rPr>
+              <w:t xml:space="preserve">quantized_phi3</w:t>
+            </w:r>
+          </w:p>
+        </w:tc>
+        <w:tc>
+          <w:tcPr/>
+          <w:p>
+            <w:pPr>
+              <w:pStyle w:val="Compact"/>
+              <w:jc w:val="left"/>
+            </w:pPr>
+            <w:r>
+              <w:t xml:space="preserve">Phi-3 / Phi-3.5</w:t>
+            </w:r>
+          </w:p>
+        </w:tc>
+      </w:tr>
+      <w:tr>
+        <w:tc>
+          <w:tcPr/>
+          <w:p>
+            <w:pPr>
+              <w:pStyle w:val="Compact"/>
+              <w:jc w:val="left"/>
+            </w:pPr>
+            <w:r>
+              <w:rPr>
+                <w:rStyle w:val="VerbatimChar"/>
+              </w:rPr>
+              <w:t xml:space="preserve">phi2</w:t>
+            </w:r>
+            <w:r>
+              <w:t xml:space="preserve">,</w:t>
+            </w:r>
+            <w:r>
+              <w:t xml:space="preserve"> </w:t>
+            </w:r>
+            <w:r>
+              <w:rPr>
+                <w:rStyle w:val="VerbatimChar"/>
+              </w:rPr>
+              <w:t xml:space="preserve">phi</w:t>
+            </w:r>
+          </w:p>
+        </w:tc>
+        <w:tc>
+          <w:tcPr/>
+          <w:p>
+            <w:pPr>
+              <w:pStyle w:val="Compact"/>
+              <w:jc w:val="left"/>
+            </w:pPr>
+            <w:r>
+              <w:rPr>
+                <w:rStyle w:val="VerbatimChar"/>
+              </w:rPr>
+              <w:t xml:space="preserve">quantized_phi</w:t>
+            </w:r>
+          </w:p>
+        </w:tc>
+        <w:tc>
+          <w:tcPr/>
+          <w:p>
+            <w:pPr>
+              <w:pStyle w:val="Compact"/>
+              <w:jc w:val="left"/>
+            </w:pPr>
+            <w:r>
+              <w:t xml:space="preserve">Phi-2</w:t>
+            </w:r>
+          </w:p>
+        </w:tc>
+      </w:tr>
+      <w:tr>
+        <w:tc>
+          <w:tcPr/>
+          <w:p>
+            <w:pPr>
+              <w:pStyle w:val="Compact"/>
+              <w:jc w:val="left"/>
+            </w:pPr>
+            <w:r>
+              <w:rPr>
+                <w:rStyle w:val="VerbatimChar"/>
+              </w:rPr>
+              <w:t xml:space="preserve">glm4</w:t>
+            </w:r>
+            <w:r>
+              <w:t xml:space="preserve">,</w:t>
+            </w:r>
+            <w:r>
+              <w:t xml:space="preserve"> </w:t>
+            </w:r>
+            <w:r>
+              <w:rPr>
+                <w:rStyle w:val="VerbatimChar"/>
+              </w:rPr>
+              <w:t xml:space="preserve">chatglm</w:t>
+            </w:r>
+          </w:p>
+        </w:tc>
+        <w:tc>
+          <w:tcPr/>
+          <w:p>
+            <w:pPr>
+              <w:pStyle w:val="Compact"/>
+              <w:jc w:val="left"/>
+            </w:pPr>
+            <w:r>
+              <w:rPr>
+                <w:rStyle w:val="VerbatimChar"/>
+              </w:rPr>
+              <w:t xml:space="preserve">quantized_glm4</w:t>
+            </w:r>
+          </w:p>
+        </w:tc>
+        <w:tc>
+          <w:tcPr/>
+          <w:p>
+            <w:pPr>
+              <w:pStyle w:val="Compact"/>
+              <w:jc w:val="left"/>
+            </w:pPr>
+            <w:r>
+              <w:t xml:space="preserve">GLM-4</w:t>
+            </w:r>
+          </w:p>
+        </w:tc>
+      </w:tr>
+      <w:tr>
+        <w:tc>
+          <w:tcPr/>
+          <w:p>
+            <w:pPr>
+              <w:pStyle w:val="Compact"/>
+              <w:jc w:val="left"/>
+            </w:pPr>
+            <w:r>
+              <w:rPr>
+                <w:iCs/>
+                <w:i/>
+              </w:rPr>
+              <w:t xml:space="preserve">(anything else)</w:t>
+            </w:r>
+          </w:p>
+        </w:tc>
+        <w:tc>
+          <w:tcPr/>
+          <w:p>
+            <w:pPr>
+              <w:pStyle w:val="Compact"/>
+              <w:jc w:val="left"/>
+            </w:pPr>
+            <w:r>
+              <w:t xml:space="preserve">falls back to</w:t>
+            </w:r>
+            <w:r>
+              <w:t xml:space="preserve"> </w:t>
+            </w:r>
+            <w:r>
+              <w:rPr>
+                <w:rStyle w:val="VerbatimChar"/>
+              </w:rPr>
+              <w:t xml:space="preserve">quantized_llama</w:t>
+            </w:r>
+          </w:p>
+        </w:tc>
+        <w:tc>
+          <w:tcPr/>
+          <w:p>
+            <w:pPr>
+              <w:pStyle w:val="Compact"/>
+              <w:jc w:val="left"/>
+            </w:pPr>
+            <w:r>
+              <w:t xml:space="preserve">best-effort</w:t>
+            </w:r>
+          </w:p>
+        </w:tc>
+      </w:tr>
+    </w:tbl>
+    <w:p>
+      <w:pPr>
+        <w:pStyle w:val="BlockText"/>
+      </w:pPr>
+      <w:r>
+        <w:rPr>
+          <w:bCs/>
+          <w:b/>
+        </w:rPr>
+        <w:t xml:space="preserve">Why this matters:</w:t>
+      </w:r>
+      <w:r>
+        <w:t xml:space="preserve"> </w:t>
+      </w:r>
+      <w:r>
+        <w:t xml:space="preserve">earlier the loader always used the Llama parser, so loading a Qwen/Gemma/Phi GGUF failed with an error like:</w:t>
+      </w:r>
+    </w:p>
+    <w:p>
+      <w:pPr>
+        <w:pStyle w:val="SourceCode"/>
+      </w:pPr>
+      <w:r>
+        <w:rPr>
+          <w:rStyle w:val="VerbatimChar"/>
+        </w:rPr>
+        <w:t xml:space="preserve">failed to load model: from_gguf: cannot find llama.attention.head_count in metadata</w:t>
+      </w:r>
+    </w:p>
+    <w:p>
+      <w:pPr>
+        <w:pStyle w:val="BlockText"/>
+      </w:pPr>
+      <w:r>
+        <w:t xml:space="preserve">That error means the GGUF was</w:t>
+      </w:r>
+      <w:r>
+        <w:t xml:space="preserve"> </w:t>
+      </w:r>
+      <w:r>
+        <w:rPr>
+          <w:bCs/>
+          <w:b/>
+        </w:rPr>
+        <w:t xml:space="preserve">not</w:t>
+      </w:r>
+      <w:r>
+        <w:t xml:space="preserve"> </w:t>
+      </w:r>
+      <w:r>
+        <w:t xml:space="preserve">a Llama-layout file — its metadata keys are prefixed with</w:t>
+      </w:r>
+      <w:r>
+        <w:t xml:space="preserve"> </w:t>
+      </w:r>
+      <w:r>
+        <w:rPr>
+          <w:rStyle w:val="VerbatimChar"/>
+        </w:rPr>
+        <w:t xml:space="preserve">qwen2.</w:t>
+      </w:r>
+      <w:r>
+        <w:t xml:space="preserve">,</w:t>
+      </w:r>
+      <w:r>
+        <w:t xml:space="preserve"> </w:t>
+      </w:r>
+      <w:r>
+        <w:rPr>
+          <w:rStyle w:val="VerbatimChar"/>
+        </w:rPr>
+        <w:t xml:space="preserve">gemma3.</w:t>
+      </w:r>
+      <w:r>
+        <w:t xml:space="preserve">, etc., not</w:t>
+      </w:r>
+      <w:r>
+        <w:t xml:space="preserve"> </w:t>
+      </w:r>
+      <w:r>
+        <w:rPr>
+          <w:rStyle w:val="VerbatimChar"/>
+        </w:rPr>
+        <w:t xml:space="preserve">llama.</w:t>
+      </w:r>
+      <w:r>
+        <w:t xml:space="preserve">. The architecture-aware dispatch now selects the correct parser, so those models load correctly. If you still hit</w:t>
+      </w:r>
+      <w:r>
+        <w:t xml:space="preserve"> </w:t>
+      </w:r>
+      <w:r>
+        <w:rPr>
+          <w:rStyle w:val="VerbatimChar"/>
+        </w:rPr>
+        <w:t xml:space="preserve">unsupported GGUF architecture "..."</w:t>
+      </w:r>
+      <w:r>
+        <w:t xml:space="preserve">, the model family isn’t wired up yet — open an issue or use a Llama/Qwen/Gemma/Phi GGUF instead.</w:t>
+      </w:r>
+    </w:p>
+    <w:p>
+      <w:pPr>
+        <w:pStyle w:val="BlockText"/>
+      </w:pPr>
+      <w:r>
+        <w:rPr>
+          <w:bCs/>
+          <w:b/>
+        </w:rPr>
+        <w:t xml:space="preserve">Check a file’s architecture</w:t>
+      </w:r>
+      <w:r>
+        <w:t xml:space="preserve"> </w:t>
+      </w:r>
+      <w:r>
+        <w:t xml:space="preserve">before downloading gigabytes:</w:t>
+      </w:r>
+    </w:p>
+    <w:p>
+      <w:pPr>
+        <w:pStyle w:val="SourceCode"/>
+      </w:pPr>
+      <w:r>
+        <w:rPr>
+          <w:rStyle w:val="ImportTok"/>
+        </w:rPr>
+        <w:t xml:space="preserve">from</w:t>
+      </w:r>
+      <w:r>
+        <w:rPr>
+          <w:rStyle w:val="NormalTok"/>
+        </w:rPr>
+        <w:t xml:space="preserve"> gguf </w:t>
+      </w:r>
+      <w:r>
+        <w:rPr>
+          <w:rStyle w:val="ImportTok"/>
+        </w:rPr>
+        <w:t xml:space="preserve">import</w:t>
+      </w:r>
+      <w:r>
+        <w:rPr>
+          <w:rStyle w:val="NormalTok"/>
+        </w:rPr>
+        <w:t xml:space="preserve"> GGUFReader</w:t>
+      </w:r>
+      <w:r>
+        <w:br/>
+      </w:r>
+      <w:r>
+        <w:rPr>
+          <w:rStyle w:val="NormalTok"/>
+        </w:rPr>
+        <w:t xml:space="preserve">r </w:t>
+      </w:r>
+      <w:r>
+        <w:rPr>
+          <w:rStyle w:val="OperatorTok"/>
+        </w:rPr>
+        <w:t xml:space="preserve">=</w:t>
+      </w:r>
+      <w:r>
+        <w:rPr>
+          <w:rStyle w:val="NormalTok"/>
+        </w:rPr>
+        <w:t xml:space="preserve"> GGUFReader(</w:t>
+      </w:r>
+      <w:r>
+        <w:rPr>
+          <w:rStyle w:val="StringTok"/>
+        </w:rPr>
+        <w:t xml:space="preserve">"model.gguf"</w:t>
+      </w:r>
+      <w:r>
+        <w:rPr>
+          <w:rStyle w:val="NormalTok"/>
+        </w:rPr>
+        <w:t xml:space="preserve">)</w:t>
+      </w:r>
+      <w:r>
+        <w:br/>
+      </w:r>
+      <w:r>
+        <w:rPr>
+          <w:rStyle w:val="BuiltInTok"/>
+        </w:rPr>
+        <w:t xml:space="preserve">print</w:t>
+      </w:r>
+      <w:r>
+        <w:rPr>
+          <w:rStyle w:val="NormalTok"/>
+        </w:rPr>
+        <w:t xml:space="preserve">(r.fields[</w:t>
+      </w:r>
+      <w:r>
+        <w:rPr>
+          <w:rStyle w:val="StringTok"/>
+        </w:rPr>
+        <w:t xml:space="preserve">"general.architecture"</w:t>
+      </w:r>
+      <w:r>
+        <w:rPr>
+          <w:rStyle w:val="NormalTok"/>
+        </w:rPr>
+        <w:t xml:space="preserve">].parts[</w:t>
+      </w:r>
+      <w:r>
+        <w:rPr>
+          <w:rStyle w:val="OperatorTok"/>
+        </w:rPr>
+        <w:t xml:space="preserve">-</w:t>
+      </w:r>
+      <w:r>
+        <w:rPr>
+          <w:rStyle w:val="DecValTok"/>
+        </w:rPr>
+        <w:t xml:space="preserve">1</w:t>
+      </w:r>
+      <w:r>
+        <w:rPr>
+          <w:rStyle w:val="NormalTok"/>
+        </w:rPr>
+        <w:t xml:space="preserve">].tobytes().decode())</w:t>
+      </w:r>
+    </w:p>
+    <w:bookmarkEnd w:id="50"/>
+    <w:bookmarkEnd w:id="51"/>
+    <w:bookmarkStart w:id="53" w:name="where-to-get-models"/>
+    <w:p>
+      <w:pPr>
+        <w:pStyle w:val="Heading3"/>
+      </w:pPr>
+      <w:r>
+        <w:t xml:space="preserve">Where to Get Models</w:t>
+      </w:r>
+    </w:p>
+    <w:p>
+      <w:pPr>
+        <w:pStyle w:val="FirstParagraph"/>
+      </w:pPr>
+      <w:r>
+        <w:t xml:space="preserve">GGUF is the quantized model format used by</w:t>
+      </w:r>
+      <w:r>
+        <w:t xml:space="preserve"> </w:t>
+      </w:r>
+      <w:r>
+        <w:rPr>
+          <w:rStyle w:val="VerbatimChar"/>
+        </w:rPr>
+        <w:t xml:space="preserve">llama.cpp</w:t>
+      </w:r>
+      <w:r>
+        <w:t xml:space="preserve"> </w:t>
+      </w:r>
+      <w:r>
+        <w:t xml:space="preserve">and supported here via</w:t>
+      </w:r>
+      <w:r>
+        <w:t xml:space="preserve"> </w:t>
+      </w:r>
+      <w:r>
+        <w:rPr>
+          <w:rStyle w:val="VerbatimChar"/>
+        </w:rPr>
+        <w:t xml:space="preserve">candle</w:t>
+      </w:r>
+      <w:r>
+        <w:t xml:space="preserve">. To swap in a real model:</w:t>
+      </w:r>
+    </w:p>
+    <w:p>
+      <w:pPr>
+        <w:pStyle w:val="BodyText"/>
+      </w:pPr>
+      <w:r>
+        <w:rPr>
+          <w:bCs/>
+          <w:b/>
+        </w:rPr>
         <w:t xml:space="preserve">1. Pick a GGUF model</w:t>
       </w:r>
       <w:r>
@@ -6908,7 +7712,7 @@
       <w:r>
         <w:t xml:space="preserve"> </w:t>
       </w:r>
-      <w:hyperlink r:id="rId51">
+      <w:hyperlink r:id="rId52">
         <w:r>
           <w:rPr>
             <w:rStyle w:val="Hyperlink"/>
@@ -7611,8 +8415,8 @@
         </w:tc>
       </w:tr>
     </w:tbl>
-    <w:bookmarkEnd w:id="52"/>
-    <w:bookmarkStart w:id="53" w:name="gpu-acceleration"/>
+    <w:bookmarkEnd w:id="53"/>
+    <w:bookmarkStart w:id="54" w:name="gpu-acceleration"/>
     <w:p>
       <w:pPr>
         <w:pStyle w:val="Heading3"/>
@@ -8099,9 +8903,9 @@
         </w:pict>
       </w:r>
     </w:p>
-    <w:bookmarkEnd w:id="53"/>
     <w:bookmarkEnd w:id="54"/>
-    <w:bookmarkStart w:id="59" w:name="configuration-settings.json"/>
+    <w:bookmarkEnd w:id="55"/>
+    <w:bookmarkStart w:id="60" w:name="configuration-settings.json"/>
     <w:p>
       <w:pPr>
         <w:pStyle w:val="Heading2"/>
@@ -8183,7 +8987,7 @@
       <w:r>
         <w:t xml:space="preserve"> </w:t>
       </w:r>
-      <w:hyperlink r:id="rId55">
+      <w:hyperlink r:id="rId56">
         <w:r>
           <w:rPr>
             <w:rStyle w:val="VerbatimChar"/>
@@ -8377,7 +9181,7 @@
         <w:t xml:space="preserve">to see the effective configuration and where it was loaded from.</w:t>
       </w:r>
     </w:p>
-    <w:bookmarkStart w:id="56" w:name="discovery-order-precedence"/>
+    <w:bookmarkStart w:id="57" w:name="discovery-order-precedence"/>
     <w:p>
       <w:pPr>
         <w:pStyle w:val="Heading3"/>
@@ -8553,8 +9357,8 @@
         <w:t xml:space="preserve">in the file. This lets you keep a stable config file and override just one thing for a single run.</w:t>
       </w:r>
     </w:p>
-    <w:bookmarkEnd w:id="56"/>
-    <w:bookmarkStart w:id="57" w:name="full-reference"/>
+    <w:bookmarkEnd w:id="57"/>
+    <w:bookmarkStart w:id="58" w:name="full-reference"/>
     <w:p>
       <w:pPr>
         <w:pStyle w:val="Heading3"/>
@@ -9740,8 +10544,8 @@
         <w:t xml:space="preserve">with a helpful error listing valid keys (catches typos early).</w:t>
       </w:r>
     </w:p>
-    <w:bookmarkEnd w:id="57"/>
-    <w:bookmarkStart w:id="58" w:name="common-recipes"/>
+    <w:bookmarkEnd w:id="58"/>
+    <w:bookmarkStart w:id="59" w:name="common-recipes"/>
     <w:p>
       <w:pPr>
         <w:pStyle w:val="Heading3"/>
@@ -10195,9 +10999,9 @@
         </w:pict>
       </w:r>
     </w:p>
-    <w:bookmarkEnd w:id="58"/>
     <w:bookmarkEnd w:id="59"/>
-    <w:bookmarkStart w:id="64" w:name="customizing-extending"/>
+    <w:bookmarkEnd w:id="60"/>
+    <w:bookmarkStart w:id="65" w:name="customizing-extending"/>
     <w:p>
       <w:pPr>
         <w:pStyle w:val="Heading2"/>
@@ -10429,7 +11233,7 @@
         </w:tc>
       </w:tr>
     </w:tbl>
-    <w:bookmarkStart w:id="60" w:name="adding-a-new-skill"/>
+    <w:bookmarkStart w:id="61" w:name="adding-a-new-skill"/>
     <w:p>
       <w:pPr>
         <w:pStyle w:val="Heading3"/>
@@ -11109,8 +11913,8 @@
         <w:t xml:space="preserve">fire on almost everything and will crowd out more precise skills.</w:t>
       </w:r>
     </w:p>
-    <w:bookmarkEnd w:id="60"/>
-    <w:bookmarkStart w:id="61" w:name="adding-a-new-tool"/>
+    <w:bookmarkEnd w:id="61"/>
+    <w:bookmarkStart w:id="62" w:name="adding-a-new-tool"/>
     <w:p>
       <w:pPr>
         <w:pStyle w:val="Heading3"/>
@@ -12514,8 +13318,8 @@
         <w:t xml:space="preserve">. If you want the same tool available to trained Needle models, add a matching entry there too.</w:t>
       </w:r>
     </w:p>
-    <w:bookmarkEnd w:id="61"/>
-    <w:bookmarkStart w:id="63" w:name="training-a-needle-model-for-a-task"/>
+    <w:bookmarkEnd w:id="62"/>
+    <w:bookmarkStart w:id="64" w:name="training-a-needle-model-for-a-task"/>
     <w:p>
       <w:pPr>
         <w:pStyle w:val="Heading3"/>
@@ -13805,7 +14609,7 @@
       <w:r>
         <w:t xml:space="preserve"> </w:t>
       </w:r>
-      <w:hyperlink r:id="rId62">
+      <w:hyperlink r:id="rId63">
         <w:r>
           <w:rPr>
             <w:rStyle w:val="VerbatimChar"/>
@@ -13923,9 +14727,9 @@
         </w:pict>
       </w:r>
     </w:p>
-    <w:bookmarkEnd w:id="63"/>
     <w:bookmarkEnd w:id="64"/>
-    <w:bookmarkStart w:id="65" w:name="engine-selection-llm-vs.-needle"/>
+    <w:bookmarkEnd w:id="65"/>
+    <w:bookmarkStart w:id="66" w:name="engine-selection-llm-vs.-needle"/>
     <w:p>
       <w:pPr>
         <w:pStyle w:val="Heading2"/>
@@ -14805,8 +15609,8 @@
         </w:pict>
       </w:r>
     </w:p>
-    <w:bookmarkEnd w:id="65"/>
-    <w:bookmarkStart w:id="67" w:name="python-sdk"/>
+    <w:bookmarkEnd w:id="66"/>
+    <w:bookmarkStart w:id="68" w:name="python-sdk"/>
     <w:p>
       <w:pPr>
         <w:pStyle w:val="Heading2"/>
@@ -14988,7 +15792,7 @@
       <w:r>
         <w:t xml:space="preserve"> </w:t>
       </w:r>
-      <w:hyperlink r:id="rId66">
+      <w:hyperlink r:id="rId67">
         <w:r>
           <w:rPr>
             <w:rStyle w:val="Hyperlink"/>
@@ -15010,8 +15814,8 @@
         </w:pict>
       </w:r>
     </w:p>
-    <w:bookmarkEnd w:id="67"/>
-    <w:bookmarkStart w:id="71" w:name="further-reading"/>
+    <w:bookmarkEnd w:id="68"/>
+    <w:bookmarkStart w:id="72" w:name="further-reading"/>
     <w:p>
       <w:pPr>
         <w:pStyle w:val="Heading2"/>
@@ -15051,7 +15855,7 @@
         </w:numPr>
         <w:pStyle w:val="Compact"/>
       </w:pPr>
-      <w:hyperlink r:id="rId68">
+      <w:hyperlink r:id="rId69">
         <w:r>
           <w:rPr>
             <w:rStyle w:val="Hyperlink"/>
@@ -15097,7 +15901,7 @@
         </w:numPr>
         <w:pStyle w:val="Compact"/>
       </w:pPr>
-      <w:hyperlink r:id="rId69">
+      <w:hyperlink r:id="rId70">
         <w:r>
           <w:rPr>
             <w:rStyle w:val="Hyperlink"/>
@@ -15132,7 +15936,7 @@
         </w:numPr>
         <w:pStyle w:val="Compact"/>
       </w:pPr>
-      <w:hyperlink r:id="rId70">
+      <w:hyperlink r:id="rId71">
         <w:r>
           <w:rPr>
             <w:rStyle w:val="Hyperlink"/>
@@ -15167,7 +15971,7 @@
         </w:numPr>
         <w:pStyle w:val="Compact"/>
       </w:pPr>
-      <w:hyperlink r:id="rId55">
+      <w:hyperlink r:id="rId56">
         <w:r>
           <w:rPr>
             <w:rStyle w:val="Hyperlink"/>
@@ -15205,7 +16009,7 @@
         </w:numPr>
         <w:pStyle w:val="Compact"/>
       </w:pPr>
-      <w:hyperlink r:id="rId62">
+      <w:hyperlink r:id="rId63">
         <w:r>
           <w:rPr>
             <w:rStyle w:val="Hyperlink"/>
@@ -15394,8 +16198,8 @@
         <w:t xml:space="preserve">--help</w:t>
       </w:r>
     </w:p>
-    <w:bookmarkEnd w:id="71"/>
     <w:bookmarkEnd w:id="72"/>
+    <w:bookmarkEnd w:id="73"/>
     <w:sectPr/>
   </w:body>
 </w:document>

</xml_diff>

<commit_message>
Improve GPU feature warning + document rebuild requirements
The runtime warning now tells users exactly how to rebuild with CUDA/Metal
support instead of a generic 'feature not enabled' message. Expanded USAGE.md
GPU Acceleration section with step-by-step CUDA and Metal build instructions,
requirements table, and the critical point that GPU support is compile-time
(--features) not runtime (--device).

Addresses the user's 'cuda feature not enabled; falling back to CPU' warning.
</commit_message>
<xml_diff>
--- a/USAGE.docx
+++ b/USAGE.docx
@@ -2,7 +2,7 @@
 <file path=word/document.xml><?xml version="1.0" encoding="utf-8"?>
 <w:document xmlns:w="http://schemas.openxmlformats.org/wordprocessingml/2006/main" xmlns:m="http://schemas.openxmlformats.org/officeDocument/2006/math" xmlns:r="http://schemas.openxmlformats.org/officeDocument/2006/relationships" xmlns:o="urn:schemas-microsoft-com:office:office" xmlns:v="urn:schemas-microsoft-com:vml" xmlns:w10="urn:schemas-microsoft-com:office:word" xmlns:a="http://schemas.openxmlformats.org/drawingml/2006/main" xmlns:pic="http://schemas.openxmlformats.org/drawingml/2006/picture" xmlns:wp="http://schemas.openxmlformats.org/drawingml/2006/wordprocessingDrawing">
   <w:body>
-    <w:bookmarkStart w:id="73" w:name="usage-guide"/>
+    <w:bookmarkStart w:id="77" w:name="usage-guide"/>
     <w:p>
       <w:pPr>
         <w:pStyle w:val="Heading1"/>
@@ -5894,7 +5894,7 @@
     </w:p>
     <w:bookmarkEnd w:id="46"/>
     <w:bookmarkEnd w:id="47"/>
-    <w:bookmarkStart w:id="55" w:name="model-selection"/>
+    <w:bookmarkStart w:id="59" w:name="model-selection"/>
     <w:p>
       <w:pPr>
         <w:pStyle w:val="Heading2"/>
@@ -8416,7 +8416,7 @@
       </w:tr>
     </w:tbl>
     <w:bookmarkEnd w:id="53"/>
-    <w:bookmarkStart w:id="54" w:name="gpu-acceleration"/>
+    <w:bookmarkStart w:id="58" w:name="gpu-acceleration"/>
     <w:p>
       <w:pPr>
         <w:pStyle w:val="Heading3"/>
@@ -8443,7 +8443,50 @@
         <w:t xml:space="preserve">off by default</w:t>
       </w:r>
       <w:r>
-        <w:t xml:space="preserve">. Enable them with cargo features:</w:t>
+        <w:t xml:space="preserve"> </w:t>
+      </w:r>
+      <w:r>
+        <w:t xml:space="preserve">to keep builds fast and portable. To enable GPU acceleration, you must</w:t>
+      </w:r>
+      <w:r>
+        <w:t xml:space="preserve"> </w:t>
+      </w:r>
+      <w:r>
+        <w:rPr>
+          <w:bCs/>
+          <w:b/>
+        </w:rPr>
+        <w:t xml:space="preserve">rebuild</w:t>
+      </w:r>
+      <w:r>
+        <w:t xml:space="preserve"> </w:t>
+      </w:r>
+      <w:r>
+        <w:t xml:space="preserve">with the corresponding Cargo feature flag — just passing</w:t>
+      </w:r>
+      <w:r>
+        <w:t xml:space="preserve"> </w:t>
+      </w:r>
+      <w:r>
+        <w:rPr>
+          <w:rStyle w:val="VerbatimChar"/>
+        </w:rPr>
+        <w:t xml:space="preserve">--device cuda</w:t>
+      </w:r>
+      <w:r>
+        <w:t xml:space="preserve"> </w:t>
+      </w:r>
+      <w:r>
+        <w:t xml:space="preserve">at runtime won’t work if the binary wasn’t compiled with GPU support.</w:t>
+      </w:r>
+    </w:p>
+    <w:bookmarkStart w:id="55" w:name="nvidia-cuda"/>
+    <w:p>
+      <w:pPr>
+        <w:pStyle w:val="Heading4"/>
+      </w:pPr>
+      <w:r>
+        <w:t xml:space="preserve">NVIDIA CUDA</w:t>
       </w:r>
     </w:p>
     <w:p>
@@ -8454,7 +8497,7 @@
         <w:rPr>
           <w:rStyle w:val="CommentTok"/>
         </w:rPr>
-        <w:t xml:space="preserve"># NVIDIA CUDA:</w:t>
+        <w:t xml:space="preserve"># Build with CUDA support (one-time):</w:t>
       </w:r>
       <w:r>
         <w:br/>
@@ -8469,6 +8512,186 @@
         <w:rPr>
           <w:rStyle w:val="NormalTok"/>
         </w:rPr>
+        <w:t xml:space="preserve"> build </w:t>
+      </w:r>
+      <w:r>
+        <w:rPr>
+          <w:rStyle w:val="AttributeTok"/>
+        </w:rPr>
+        <w:t xml:space="preserve">-p</w:t>
+      </w:r>
+      <w:r>
+        <w:rPr>
+          <w:rStyle w:val="NormalTok"/>
+        </w:rPr>
+        <w:t xml:space="preserve"> graphdb-cli </w:t>
+      </w:r>
+      <w:r>
+        <w:rPr>
+          <w:rStyle w:val="AttributeTok"/>
+        </w:rPr>
+        <w:t xml:space="preserve">--features</w:t>
+      </w:r>
+      <w:r>
+        <w:rPr>
+          <w:rStyle w:val="NormalTok"/>
+        </w:rPr>
+        <w:t xml:space="preserve"> cuda </w:t>
+      </w:r>
+      <w:r>
+        <w:rPr>
+          <w:rStyle w:val="AttributeTok"/>
+        </w:rPr>
+        <w:t xml:space="preserve">--release</w:t>
+      </w:r>
+      <w:r>
+        <w:br/>
+      </w:r>
+      <w:r>
+        <w:br/>
+      </w:r>
+      <w:r>
+        <w:rPr>
+          <w:rStyle w:val="CommentTok"/>
+        </w:rPr>
+        <w:t xml:space="preserve"># Then run with --device cuda:</w:t>
+      </w:r>
+      <w:r>
+        <w:br/>
+      </w:r>
+      <w:r>
+        <w:rPr>
+          <w:rStyle w:val="ExtensionTok"/>
+        </w:rPr>
+        <w:t xml:space="preserve">./target/release/graphdb-cli</w:t>
+      </w:r>
+      <w:r>
+        <w:rPr>
+          <w:rStyle w:val="NormalTok"/>
+        </w:rPr>
+        <w:t xml:space="preserve"> </w:t>
+      </w:r>
+      <w:r>
+        <w:rPr>
+          <w:rStyle w:val="DataTypeTok"/>
+        </w:rPr>
+        <w:t xml:space="preserve">\</w:t>
+      </w:r>
+      <w:r>
+        <w:br/>
+      </w:r>
+      <w:r>
+        <w:rPr>
+          <w:rStyle w:val="NormalTok"/>
+        </w:rPr>
+        <w:t xml:space="preserve">  </w:t>
+      </w:r>
+      <w:r>
+        <w:rPr>
+          <w:rStyle w:val="AttributeTok"/>
+        </w:rPr>
+        <w:t xml:space="preserve">--device</w:t>
+      </w:r>
+      <w:r>
+        <w:rPr>
+          <w:rStyle w:val="NormalTok"/>
+        </w:rPr>
+        <w:t xml:space="preserve"> cuda </w:t>
+      </w:r>
+      <w:r>
+        <w:rPr>
+          <w:rStyle w:val="DataTypeTok"/>
+        </w:rPr>
+        <w:t xml:space="preserve">\</w:t>
+      </w:r>
+      <w:r>
+        <w:br/>
+      </w:r>
+      <w:r>
+        <w:rPr>
+          <w:rStyle w:val="NormalTok"/>
+        </w:rPr>
+        <w:t xml:space="preserve">  </w:t>
+      </w:r>
+      <w:r>
+        <w:rPr>
+          <w:rStyle w:val="AttributeTok"/>
+        </w:rPr>
+        <w:t xml:space="preserve">--model</w:t>
+      </w:r>
+      <w:r>
+        <w:rPr>
+          <w:rStyle w:val="NormalTok"/>
+        </w:rPr>
+        <w:t xml:space="preserve"> /path/to/model.gguf </w:t>
+      </w:r>
+      <w:r>
+        <w:rPr>
+          <w:rStyle w:val="DataTypeTok"/>
+        </w:rPr>
+        <w:t xml:space="preserve">\</w:t>
+      </w:r>
+      <w:r>
+        <w:br/>
+      </w:r>
+      <w:r>
+        <w:rPr>
+          <w:rStyle w:val="NormalTok"/>
+        </w:rPr>
+        <w:t xml:space="preserve">  </w:t>
+      </w:r>
+      <w:r>
+        <w:rPr>
+          <w:rStyle w:val="AttributeTok"/>
+        </w:rPr>
+        <w:t xml:space="preserve">--tokenizer</w:t>
+      </w:r>
+      <w:r>
+        <w:rPr>
+          <w:rStyle w:val="NormalTok"/>
+        </w:rPr>
+        <w:t xml:space="preserve"> /path/to/tokenizer.json </w:t>
+      </w:r>
+      <w:r>
+        <w:rPr>
+          <w:rStyle w:val="DataTypeTok"/>
+        </w:rPr>
+        <w:t xml:space="preserve">\</w:t>
+      </w:r>
+      <w:r>
+        <w:br/>
+      </w:r>
+      <w:r>
+        <w:rPr>
+          <w:rStyle w:val="NormalTok"/>
+        </w:rPr>
+        <w:t xml:space="preserve">  agent</w:t>
+      </w:r>
+      <w:r>
+        <w:br/>
+      </w:r>
+      <w:r>
+        <w:br/>
+      </w:r>
+      <w:r>
+        <w:rPr>
+          <w:rStyle w:val="CommentTok"/>
+        </w:rPr>
+        <w:t xml:space="preserve"># Or via cargo run (rebuilds if needed):</w:t>
+      </w:r>
+      <w:r>
+        <w:br/>
+      </w:r>
+      <w:r>
+        <w:rPr>
+          <w:rStyle w:val="ExtensionTok"/>
+        </w:rPr>
+        <w:t xml:space="preserve">cargo</w:t>
+      </w:r>
+      <w:r>
+        <w:rPr>
+          <w:rStyle w:val="NormalTok"/>
+        </w:rPr>
         <w:t xml:space="preserve"> run </w:t>
       </w:r>
       <w:r>
@@ -8499,6 +8722,18 @@
         <w:rPr>
           <w:rStyle w:val="AttributeTok"/>
         </w:rPr>
+        <w:t xml:space="preserve">--release</w:t>
+      </w:r>
+      <w:r>
+        <w:rPr>
+          <w:rStyle w:val="NormalTok"/>
+        </w:rPr>
+        <w:t xml:space="preserve"> </w:t>
+      </w:r>
+      <w:r>
+        <w:rPr>
+          <w:rStyle w:val="AttributeTok"/>
+        </w:rPr>
         <w:t xml:space="preserve">--</w:t>
       </w:r>
       <w:r>
@@ -8601,25 +8836,60 @@
         <w:rPr>
           <w:rStyle w:val="NormalTok"/>
         </w:rPr>
-        <w:t xml:space="preserve">  generate </w:t>
-      </w:r>
-      <w:r>
-        <w:rPr>
-          <w:rStyle w:val="StringTok"/>
-        </w:rPr>
-        <w:t xml:space="preserve">"..."</w:t>
-      </w:r>
-      <w:r>
-        <w:br/>
-      </w:r>
-      <w:r>
-        <w:br/>
-      </w:r>
+        <w:t xml:space="preserve">  agent</w:t>
+      </w:r>
+    </w:p>
+    <w:p>
+      <w:pPr>
+        <w:pStyle w:val="FirstParagraph"/>
+      </w:pPr>
+      <w:r>
+        <w:rPr>
+          <w:bCs/>
+          <w:b/>
+        </w:rPr>
+        <w:t xml:space="preserve">Requirements:</w:t>
+      </w:r>
+      <w:r>
+        <w:t xml:space="preserve"> </w:t>
+      </w:r>
+      <w:r>
+        <w:t xml:space="preserve">CUDA toolkit 11.x or 12.x, cuDNN. Install via</w:t>
+      </w:r>
+      <w:r>
+        <w:t xml:space="preserve"> </w:t>
+      </w:r>
+      <w:hyperlink r:id="rId54">
+        <w:r>
+          <w:rPr>
+            <w:rStyle w:val="Hyperlink"/>
+          </w:rPr>
+          <w:t xml:space="preserve">NVIDIA’s docs</w:t>
+        </w:r>
+      </w:hyperlink>
+      <w:r>
+        <w:t xml:space="preserve">.</w:t>
+      </w:r>
+    </w:p>
+    <w:bookmarkEnd w:id="55"/>
+    <w:bookmarkStart w:id="56" w:name="apple-metal-m1m2m3"/>
+    <w:p>
+      <w:pPr>
+        <w:pStyle w:val="Heading4"/>
+      </w:pPr>
+      <w:r>
+        <w:t xml:space="preserve">Apple Metal (M1/M2/M3)</w:t>
+      </w:r>
+    </w:p>
+    <w:p>
+      <w:pPr>
+        <w:pStyle w:val="SourceCode"/>
+      </w:pPr>
       <w:r>
         <w:rPr>
           <w:rStyle w:val="CommentTok"/>
         </w:rPr>
-        <w:t xml:space="preserve"># Apple Metal:</w:t>
+        <w:t xml:space="preserve"># Build with Metal support (one-time):</w:t>
       </w:r>
       <w:r>
         <w:br/>
@@ -8634,7 +8904,7 @@
         <w:rPr>
           <w:rStyle w:val="NormalTok"/>
         </w:rPr>
-        <w:t xml:space="preserve"> run </w:t>
+        <w:t xml:space="preserve"> build </w:t>
       </w:r>
       <w:r>
         <w:rPr>
@@ -8664,7 +8934,28 @@
         <w:rPr>
           <w:rStyle w:val="AttributeTok"/>
         </w:rPr>
-        <w:t xml:space="preserve">--</w:t>
+        <w:t xml:space="preserve">--release</w:t>
+      </w:r>
+      <w:r>
+        <w:br/>
+      </w:r>
+      <w:r>
+        <w:br/>
+      </w:r>
+      <w:r>
+        <w:rPr>
+          <w:rStyle w:val="CommentTok"/>
+        </w:rPr>
+        <w:t xml:space="preserve"># Then run with --device metal:</w:t>
+      </w:r>
+      <w:r>
+        <w:br/>
+      </w:r>
+      <w:r>
+        <w:rPr>
+          <w:rStyle w:val="ExtensionTok"/>
+        </w:rPr>
+        <w:t xml:space="preserve">./target/release/graphdb-cli</w:t>
       </w:r>
       <w:r>
         <w:rPr>
@@ -8766,13 +9057,7 @@
         <w:rPr>
           <w:rStyle w:val="NormalTok"/>
         </w:rPr>
-        <w:t xml:space="preserve">  generate </w:t>
-      </w:r>
-      <w:r>
-        <w:rPr>
-          <w:rStyle w:val="StringTok"/>
-        </w:rPr>
-        <w:t xml:space="preserve">"..."</w:t>
+        <w:t xml:space="preserve">  agent</w:t>
       </w:r>
     </w:p>
     <w:p>
@@ -8780,120 +9065,347 @@
         <w:pStyle w:val="FirstParagraph"/>
       </w:pPr>
       <w:r>
-        <w:t xml:space="preserve">Available features (per crate):</w:t>
-      </w:r>
-      <w:r>
-        <w:t xml:space="preserve"> </w:t>
-      </w:r>
-      <w:r>
-        <w:t xml:space="preserve">-</w:t>
-      </w:r>
-      <w:r>
-        <w:t xml:space="preserve"> </w:t>
-      </w:r>
-      <w:r>
-        <w:rPr>
-          <w:rStyle w:val="VerbatimChar"/>
-        </w:rPr>
-        <w:t xml:space="preserve">cuda</w:t>
-      </w:r>
-      <w:r>
-        <w:t xml:space="preserve"> </w:t>
-      </w:r>
-      <w:r>
-        <w:t xml:space="preserve">— NVIDIA GPU (via cuDNN)</w:t>
-      </w:r>
-      <w:r>
-        <w:t xml:space="preserve"> </w:t>
-      </w:r>
-      <w:r>
-        <w:t xml:space="preserve">-</w:t>
-      </w:r>
-      <w:r>
-        <w:t xml:space="preserve"> </w:t>
-      </w:r>
-      <w:r>
-        <w:rPr>
-          <w:rStyle w:val="VerbatimChar"/>
-        </w:rPr>
-        <w:t xml:space="preserve">metal</w:t>
-      </w:r>
-      <w:r>
-        <w:t xml:space="preserve"> </w:t>
-      </w:r>
-      <w:r>
-        <w:t xml:space="preserve">— Apple GPU (M1/M2/M3)</w:t>
-      </w:r>
-      <w:r>
-        <w:t xml:space="preserve"> </w:t>
-      </w:r>
-      <w:r>
-        <w:t xml:space="preserve">-</w:t>
-      </w:r>
-      <w:r>
-        <w:t xml:space="preserve"> </w:t>
-      </w:r>
-      <w:r>
-        <w:rPr>
-          <w:rStyle w:val="VerbatimChar"/>
-        </w:rPr>
-        <w:t xml:space="preserve">rocm</w:t>
-      </w:r>
-      <w:r>
-        <w:t xml:space="preserve"> </w:t>
-      </w:r>
-      <w:r>
-        <w:t xml:space="preserve">— AMD GPU (experimental)</w:t>
-      </w:r>
-      <w:r>
-        <w:t xml:space="preserve"> </w:t>
-      </w:r>
-      <w:r>
-        <w:t xml:space="preserve">-</w:t>
-      </w:r>
-      <w:r>
-        <w:t xml:space="preserve"> </w:t>
-      </w:r>
-      <w:r>
-        <w:rPr>
-          <w:rStyle w:val="VerbatimChar"/>
-        </w:rPr>
-        <w:t xml:space="preserve">mkl</w:t>
-      </w:r>
-      <w:r>
-        <w:t xml:space="preserve"> </w:t>
-      </w:r>
-      <w:r>
-        <w:t xml:space="preserve">— Intel MKL (CPU acceleration)</w:t>
-      </w:r>
-      <w:r>
-        <w:t xml:space="preserve"> </w:t>
-      </w:r>
-      <w:r>
-        <w:t xml:space="preserve">-</w:t>
-      </w:r>
-      <w:r>
-        <w:t xml:space="preserve"> </w:t>
-      </w:r>
-      <w:r>
-        <w:rPr>
-          <w:rStyle w:val="VerbatimChar"/>
-        </w:rPr>
-        <w:t xml:space="preserve">flash-attn</w:t>
-      </w:r>
-      <w:r>
-        <w:t xml:space="preserve"> </w:t>
-      </w:r>
-      <w:r>
-        <w:t xml:space="preserve">— Flash Attention 2 (CUDA only)</w:t>
-      </w:r>
-    </w:p>
-    <w:p>
-      <w:pPr>
-        <w:pStyle w:val="BodyText"/>
-      </w:pPr>
-      <w:r>
-        <w:t xml:space="preserve">Without a feature flag, everything runs on CPU.</w:t>
+        <w:rPr>
+          <w:bCs/>
+          <w:b/>
+        </w:rPr>
+        <w:t xml:space="preserve">Requirements:</w:t>
+      </w:r>
+      <w:r>
+        <w:t xml:space="preserve"> </w:t>
+      </w:r>
+      <w:r>
+        <w:t xml:space="preserve">macOS 12.3+ with Apple Silicon. No additional setup needed.</w:t>
+      </w:r>
+    </w:p>
+    <w:bookmarkEnd w:id="56"/>
+    <w:bookmarkStart w:id="57" w:name="available-features"/>
+    <w:p>
+      <w:pPr>
+        <w:pStyle w:val="Heading4"/>
+      </w:pPr>
+      <w:r>
+        <w:t xml:space="preserve">Available Features</w:t>
+      </w:r>
+    </w:p>
+    <w:tbl>
+      <w:tblPr>
+        <w:tblStyle w:val="Table"/>
+        <w:tblW w:type="auto" w:w="0"/>
+        <w:tblLook w:firstRow="1" w:lastRow="0" w:firstColumn="0" w:lastColumn="0" w:noHBand="0" w:noVBand="0" w:val="0020"/>
+      </w:tblPr>
+      <w:tblGrid>
+        <w:gridCol w:w="2640"/>
+        <w:gridCol w:w="2640"/>
+        <w:gridCol w:w="2640"/>
+      </w:tblGrid>
+      <w:tr>
+        <w:trPr>
+          <w:tblHeader w:val="true"/>
+        </w:trPr>
+        <w:tc>
+          <w:tcPr/>
+          <w:p>
+            <w:pPr>
+              <w:pStyle w:val="Compact"/>
+              <w:jc w:val="left"/>
+            </w:pPr>
+            <w:r>
+              <w:t xml:space="preserve">Feature</w:t>
+            </w:r>
+          </w:p>
+        </w:tc>
+        <w:tc>
+          <w:tcPr/>
+          <w:p>
+            <w:pPr>
+              <w:pStyle w:val="Compact"/>
+              <w:jc w:val="left"/>
+            </w:pPr>
+            <w:r>
+              <w:t xml:space="preserve">Backend</w:t>
+            </w:r>
+          </w:p>
+        </w:tc>
+        <w:tc>
+          <w:tcPr/>
+          <w:p>
+            <w:pPr>
+              <w:pStyle w:val="Compact"/>
+              <w:jc w:val="left"/>
+            </w:pPr>
+            <w:r>
+              <w:t xml:space="preserve">Notes</w:t>
+            </w:r>
+          </w:p>
+        </w:tc>
+      </w:tr>
+      <w:tr>
+        <w:tc>
+          <w:tcPr/>
+          <w:p>
+            <w:pPr>
+              <w:pStyle w:val="Compact"/>
+              <w:jc w:val="left"/>
+            </w:pPr>
+            <w:r>
+              <w:rPr>
+                <w:rStyle w:val="VerbatimChar"/>
+              </w:rPr>
+              <w:t xml:space="preserve">cuda</w:t>
+            </w:r>
+          </w:p>
+        </w:tc>
+        <w:tc>
+          <w:tcPr/>
+          <w:p>
+            <w:pPr>
+              <w:pStyle w:val="Compact"/>
+              <w:jc w:val="left"/>
+            </w:pPr>
+            <w:r>
+              <w:t xml:space="preserve">NVIDIA GPU</w:t>
+            </w:r>
+          </w:p>
+        </w:tc>
+        <w:tc>
+          <w:tcPr/>
+          <w:p>
+            <w:pPr>
+              <w:pStyle w:val="Compact"/>
+              <w:jc w:val="left"/>
+            </w:pPr>
+            <w:r>
+              <w:t xml:space="preserve">via cuDNN; requires CUDA toolkit</w:t>
+            </w:r>
+          </w:p>
+        </w:tc>
+      </w:tr>
+      <w:tr>
+        <w:tc>
+          <w:tcPr/>
+          <w:p>
+            <w:pPr>
+              <w:pStyle w:val="Compact"/>
+              <w:jc w:val="left"/>
+            </w:pPr>
+            <w:r>
+              <w:rPr>
+                <w:rStyle w:val="VerbatimChar"/>
+              </w:rPr>
+              <w:t xml:space="preserve">metal</w:t>
+            </w:r>
+          </w:p>
+        </w:tc>
+        <w:tc>
+          <w:tcPr/>
+          <w:p>
+            <w:pPr>
+              <w:pStyle w:val="Compact"/>
+              <w:jc w:val="left"/>
+            </w:pPr>
+            <w:r>
+              <w:t xml:space="preserve">Apple GPU</w:t>
+            </w:r>
+          </w:p>
+        </w:tc>
+        <w:tc>
+          <w:tcPr/>
+          <w:p>
+            <w:pPr>
+              <w:pStyle w:val="Compact"/>
+              <w:jc w:val="left"/>
+            </w:pPr>
+            <w:r>
+              <w:t xml:space="preserve">M1/M2/M3; macOS only</w:t>
+            </w:r>
+          </w:p>
+        </w:tc>
+      </w:tr>
+      <w:tr>
+        <w:tc>
+          <w:tcPr/>
+          <w:p>
+            <w:pPr>
+              <w:pStyle w:val="Compact"/>
+              <w:jc w:val="left"/>
+            </w:pPr>
+            <w:r>
+              <w:rPr>
+                <w:rStyle w:val="VerbatimChar"/>
+              </w:rPr>
+              <w:t xml:space="preserve">rocm</w:t>
+            </w:r>
+          </w:p>
+        </w:tc>
+        <w:tc>
+          <w:tcPr/>
+          <w:p>
+            <w:pPr>
+              <w:pStyle w:val="Compact"/>
+              <w:jc w:val="left"/>
+            </w:pPr>
+            <w:r>
+              <w:t xml:space="preserve">AMD GPU</w:t>
+            </w:r>
+          </w:p>
+        </w:tc>
+        <w:tc>
+          <w:tcPr/>
+          <w:p>
+            <w:pPr>
+              <w:pStyle w:val="Compact"/>
+              <w:jc w:val="left"/>
+            </w:pPr>
+            <w:r>
+              <w:t xml:space="preserve">experimental; Linux only</w:t>
+            </w:r>
+          </w:p>
+        </w:tc>
+      </w:tr>
+      <w:tr>
+        <w:tc>
+          <w:tcPr/>
+          <w:p>
+            <w:pPr>
+              <w:pStyle w:val="Compact"/>
+              <w:jc w:val="left"/>
+            </w:pPr>
+            <w:r>
+              <w:rPr>
+                <w:rStyle w:val="VerbatimChar"/>
+              </w:rPr>
+              <w:t xml:space="preserve">mkl</w:t>
+            </w:r>
+          </w:p>
+        </w:tc>
+        <w:tc>
+          <w:tcPr/>
+          <w:p>
+            <w:pPr>
+              <w:pStyle w:val="Compact"/>
+              <w:jc w:val="left"/>
+            </w:pPr>
+            <w:r>
+              <w:t xml:space="preserve">Intel MKL</w:t>
+            </w:r>
+          </w:p>
+        </w:tc>
+        <w:tc>
+          <w:tcPr/>
+          <w:p>
+            <w:pPr>
+              <w:pStyle w:val="Compact"/>
+              <w:jc w:val="left"/>
+            </w:pPr>
+            <w:r>
+              <w:t xml:space="preserve">CPU acceleration for x86</w:t>
+            </w:r>
+          </w:p>
+        </w:tc>
+      </w:tr>
+      <w:tr>
+        <w:tc>
+          <w:tcPr/>
+          <w:p>
+            <w:pPr>
+              <w:pStyle w:val="Compact"/>
+              <w:jc w:val="left"/>
+            </w:pPr>
+            <w:r>
+              <w:rPr>
+                <w:rStyle w:val="VerbatimChar"/>
+              </w:rPr>
+              <w:t xml:space="preserve">flash-attn</w:t>
+            </w:r>
+          </w:p>
+        </w:tc>
+        <w:tc>
+          <w:tcPr/>
+          <w:p>
+            <w:pPr>
+              <w:pStyle w:val="Compact"/>
+              <w:jc w:val="left"/>
+            </w:pPr>
+            <w:r>
+              <w:t xml:space="preserve">Flash Attention 2</w:t>
+            </w:r>
+          </w:p>
+        </w:tc>
+        <w:tc>
+          <w:tcPr/>
+          <w:p>
+            <w:pPr>
+              <w:pStyle w:val="Compact"/>
+              <w:jc w:val="left"/>
+            </w:pPr>
+            <w:r>
+              <w:t xml:space="preserve">CUDA only; faster attention</w:t>
+            </w:r>
+          </w:p>
+        </w:tc>
+      </w:tr>
+    </w:tbl>
+    <w:p>
+      <w:pPr>
+        <w:pStyle w:val="BlockText"/>
+      </w:pPr>
+      <w:r>
+        <w:rPr>
+          <w:bCs/>
+          <w:b/>
+        </w:rPr>
+        <w:t xml:space="preserve">Tip:</w:t>
+      </w:r>
+      <w:r>
+        <w:t xml:space="preserve"> </w:t>
+      </w:r>
+      <w:r>
+        <w:t xml:space="preserve">You can set</w:t>
+      </w:r>
+      <w:r>
+        <w:t xml:space="preserve"> </w:t>
+      </w:r>
+      <w:r>
+        <w:rPr>
+          <w:rStyle w:val="VerbatimChar"/>
+        </w:rPr>
+        <w:t xml:space="preserve">"device": "cuda"</w:t>
+      </w:r>
+      <w:r>
+        <w:t xml:space="preserve"> </w:t>
+      </w:r>
+      <w:r>
+        <w:t xml:space="preserve">in</w:t>
+      </w:r>
+      <w:r>
+        <w:t xml:space="preserve"> </w:t>
+      </w:r>
+      <w:hyperlink w:anchor="configuration-settingsjson">
+        <w:r>
+          <w:rPr>
+            <w:rStyle w:val="VerbatimChar"/>
+          </w:rPr>
+          <w:t xml:space="preserve">settings.json</w:t>
+        </w:r>
+      </w:hyperlink>
+      <w:r>
+        <w:t xml:space="preserve"> </w:t>
+      </w:r>
+      <w:r>
+        <w:t xml:space="preserve">so you never have to type the flag again — but remember the binary must still be compiled with</w:t>
+      </w:r>
+      <w:r>
+        <w:t xml:space="preserve"> </w:t>
+      </w:r>
+      <w:r>
+        <w:rPr>
+          <w:rStyle w:val="VerbatimChar"/>
+        </w:rPr>
+        <w:t xml:space="preserve">--features cuda</w:t>
+      </w:r>
+      <w:r>
+        <w:t xml:space="preserve">.</w:t>
       </w:r>
     </w:p>
     <w:p>
@@ -8903,9 +9415,10 @@
         </w:pict>
       </w:r>
     </w:p>
-    <w:bookmarkEnd w:id="54"/>
-    <w:bookmarkEnd w:id="55"/>
-    <w:bookmarkStart w:id="60" w:name="configuration-settings.json"/>
+    <w:bookmarkEnd w:id="57"/>
+    <w:bookmarkEnd w:id="58"/>
+    <w:bookmarkEnd w:id="59"/>
+    <w:bookmarkStart w:id="64" w:name="configuration-settings.json"/>
     <w:p>
       <w:pPr>
         <w:pStyle w:val="Heading2"/>
@@ -8987,7 +9500,7 @@
       <w:r>
         <w:t xml:space="preserve"> </w:t>
       </w:r>
-      <w:hyperlink r:id="rId56">
+      <w:hyperlink r:id="rId60">
         <w:r>
           <w:rPr>
             <w:rStyle w:val="VerbatimChar"/>
@@ -9181,7 +9694,7 @@
         <w:t xml:space="preserve">to see the effective configuration and where it was loaded from.</w:t>
       </w:r>
     </w:p>
-    <w:bookmarkStart w:id="57" w:name="discovery-order-precedence"/>
+    <w:bookmarkStart w:id="61" w:name="discovery-order-precedence"/>
     <w:p>
       <w:pPr>
         <w:pStyle w:val="Heading3"/>
@@ -9357,8 +9870,8 @@
         <w:t xml:space="preserve">in the file. This lets you keep a stable config file and override just one thing for a single run.</w:t>
       </w:r>
     </w:p>
-    <w:bookmarkEnd w:id="57"/>
-    <w:bookmarkStart w:id="58" w:name="full-reference"/>
+    <w:bookmarkEnd w:id="61"/>
+    <w:bookmarkStart w:id="62" w:name="full-reference"/>
     <w:p>
       <w:pPr>
         <w:pStyle w:val="Heading3"/>
@@ -10544,8 +11057,8 @@
         <w:t xml:space="preserve">with a helpful error listing valid keys (catches typos early).</w:t>
       </w:r>
     </w:p>
-    <w:bookmarkEnd w:id="58"/>
-    <w:bookmarkStart w:id="59" w:name="common-recipes"/>
+    <w:bookmarkEnd w:id="62"/>
+    <w:bookmarkStart w:id="63" w:name="common-recipes"/>
     <w:p>
       <w:pPr>
         <w:pStyle w:val="Heading3"/>
@@ -10999,9 +11512,9 @@
         </w:pict>
       </w:r>
     </w:p>
-    <w:bookmarkEnd w:id="59"/>
-    <w:bookmarkEnd w:id="60"/>
-    <w:bookmarkStart w:id="65" w:name="customizing-extending"/>
+    <w:bookmarkEnd w:id="63"/>
+    <w:bookmarkEnd w:id="64"/>
+    <w:bookmarkStart w:id="69" w:name="customizing-extending"/>
     <w:p>
       <w:pPr>
         <w:pStyle w:val="Heading2"/>
@@ -11233,7 +11746,7 @@
         </w:tc>
       </w:tr>
     </w:tbl>
-    <w:bookmarkStart w:id="61" w:name="adding-a-new-skill"/>
+    <w:bookmarkStart w:id="65" w:name="adding-a-new-skill"/>
     <w:p>
       <w:pPr>
         <w:pStyle w:val="Heading3"/>
@@ -11913,8 +12426,8 @@
         <w:t xml:space="preserve">fire on almost everything and will crowd out more precise skills.</w:t>
       </w:r>
     </w:p>
-    <w:bookmarkEnd w:id="61"/>
-    <w:bookmarkStart w:id="62" w:name="adding-a-new-tool"/>
+    <w:bookmarkEnd w:id="65"/>
+    <w:bookmarkStart w:id="66" w:name="adding-a-new-tool"/>
     <w:p>
       <w:pPr>
         <w:pStyle w:val="Heading3"/>
@@ -13318,8 +13831,8 @@
         <w:t xml:space="preserve">. If you want the same tool available to trained Needle models, add a matching entry there too.</w:t>
       </w:r>
     </w:p>
-    <w:bookmarkEnd w:id="62"/>
-    <w:bookmarkStart w:id="64" w:name="training-a-needle-model-for-a-task"/>
+    <w:bookmarkEnd w:id="66"/>
+    <w:bookmarkStart w:id="68" w:name="training-a-needle-model-for-a-task"/>
     <w:p>
       <w:pPr>
         <w:pStyle w:val="Heading3"/>
@@ -14609,7 +15122,7 @@
       <w:r>
         <w:t xml:space="preserve"> </w:t>
       </w:r>
-      <w:hyperlink r:id="rId63">
+      <w:hyperlink r:id="rId67">
         <w:r>
           <w:rPr>
             <w:rStyle w:val="VerbatimChar"/>
@@ -14727,9 +15240,9 @@
         </w:pict>
       </w:r>
     </w:p>
-    <w:bookmarkEnd w:id="64"/>
-    <w:bookmarkEnd w:id="65"/>
-    <w:bookmarkStart w:id="66" w:name="engine-selection-llm-vs.-needle"/>
+    <w:bookmarkEnd w:id="68"/>
+    <w:bookmarkEnd w:id="69"/>
+    <w:bookmarkStart w:id="70" w:name="engine-selection-llm-vs.-needle"/>
     <w:p>
       <w:pPr>
         <w:pStyle w:val="Heading2"/>
@@ -15609,8 +16122,8 @@
         </w:pict>
       </w:r>
     </w:p>
-    <w:bookmarkEnd w:id="66"/>
-    <w:bookmarkStart w:id="68" w:name="python-sdk"/>
+    <w:bookmarkEnd w:id="70"/>
+    <w:bookmarkStart w:id="72" w:name="python-sdk"/>
     <w:p>
       <w:pPr>
         <w:pStyle w:val="Heading2"/>
@@ -15792,7 +16305,7 @@
       <w:r>
         <w:t xml:space="preserve"> </w:t>
       </w:r>
-      <w:hyperlink r:id="rId67">
+      <w:hyperlink r:id="rId71">
         <w:r>
           <w:rPr>
             <w:rStyle w:val="Hyperlink"/>
@@ -15814,8 +16327,8 @@
         </w:pict>
       </w:r>
     </w:p>
-    <w:bookmarkEnd w:id="68"/>
-    <w:bookmarkStart w:id="72" w:name="further-reading"/>
+    <w:bookmarkEnd w:id="72"/>
+    <w:bookmarkStart w:id="76" w:name="further-reading"/>
     <w:p>
       <w:pPr>
         <w:pStyle w:val="Heading2"/>
@@ -15855,7 +16368,7 @@
         </w:numPr>
         <w:pStyle w:val="Compact"/>
       </w:pPr>
-      <w:hyperlink r:id="rId69">
+      <w:hyperlink r:id="rId73">
         <w:r>
           <w:rPr>
             <w:rStyle w:val="Hyperlink"/>
@@ -15901,7 +16414,7 @@
         </w:numPr>
         <w:pStyle w:val="Compact"/>
       </w:pPr>
-      <w:hyperlink r:id="rId70">
+      <w:hyperlink r:id="rId74">
         <w:r>
           <w:rPr>
             <w:rStyle w:val="Hyperlink"/>
@@ -15936,7 +16449,7 @@
         </w:numPr>
         <w:pStyle w:val="Compact"/>
       </w:pPr>
-      <w:hyperlink r:id="rId71">
+      <w:hyperlink r:id="rId75">
         <w:r>
           <w:rPr>
             <w:rStyle w:val="Hyperlink"/>
@@ -15971,7 +16484,7 @@
         </w:numPr>
         <w:pStyle w:val="Compact"/>
       </w:pPr>
-      <w:hyperlink r:id="rId56">
+      <w:hyperlink r:id="rId60">
         <w:r>
           <w:rPr>
             <w:rStyle w:val="Hyperlink"/>
@@ -16009,7 +16522,7 @@
         </w:numPr>
         <w:pStyle w:val="Compact"/>
       </w:pPr>
-      <w:hyperlink r:id="rId63">
+      <w:hyperlink r:id="rId67">
         <w:r>
           <w:rPr>
             <w:rStyle w:val="Hyperlink"/>
@@ -16198,8 +16711,8 @@
         <w:t xml:space="preserve">--help</w:t>
       </w:r>
     </w:p>
-    <w:bookmarkEnd w:id="72"/>
-    <w:bookmarkEnd w:id="73"/>
+    <w:bookmarkEnd w:id="76"/>
+    <w:bookmarkEnd w:id="77"/>
     <w:sectPr/>
   </w:body>
 </w:document>

</xml_diff>